<commit_message>
bättre nu för när man öppnar word, blev felformaterat förut
</commit_message>
<xml_diff>
--- a/public/filer/Motion-Mall.docx
+++ b/public/filer/Motion-Mall.docx
@@ -283,7 +283,7 @@
           </wp:positionV>
           <wp:extent cx="876300" cy="638175"/>
           <wp:effectExtent b="0" l="0" r="0" t="0"/>
-          <wp:wrapSquare wrapText="bothSides" distB="114300" distT="114300" distL="114300" distR="114300"/>
+          <wp:wrapNone/>
           <wp:docPr id="1" name="image1.png"/>
           <a:graphic>
             <a:graphicData uri="http://schemas.openxmlformats.org/drawingml/2006/picture">
@@ -368,6 +368,7 @@
         </w:tcPr>
         <w:p>
           <w:pPr>
+            <w:ind w:left="141.7322834645671" w:firstLine="0"/>
             <w:rPr>
               <w:rFonts w:ascii="Barlow Condensed" w:cs="Barlow Condensed" w:eastAsia="Barlow Condensed" w:hAnsi="Barlow Condensed"/>
               <w:sz w:val="24"/>
@@ -408,6 +409,7 @@
           <w:pPr>
             <w:widowControl w:val="0"/>
             <w:spacing w:line="240" w:lineRule="auto"/>
+            <w:ind w:left="131.57480314960623" w:firstLine="0"/>
             <w:rPr>
               <w:rFonts w:ascii="Barlow Condensed" w:cs="Barlow Condensed" w:eastAsia="Barlow Condensed" w:hAnsi="Barlow Condensed"/>
               <w:sz w:val="24"/>
@@ -448,6 +450,7 @@
           <w:pPr>
             <w:widowControl w:val="0"/>
             <w:spacing w:line="240" w:lineRule="auto"/>
+            <w:ind w:left="-141.7322834645671" w:firstLine="0"/>
             <w:jc w:val="right"/>
             <w:rPr>
               <w:rFonts w:ascii="Barlow Condensed" w:cs="Barlow Condensed" w:eastAsia="Barlow Condensed" w:hAnsi="Barlow Condensed"/>

</xml_diff>